<commit_message>
Use clean Geomechanics release URL in final manuscript
</commit_message>
<xml_diff>
--- a/manuscript/A reproducible reliability benchmark for non.docx
+++ b/manuscript/A reproducible reliability benchmark for non.docx
@@ -12906,7 +12906,7 @@
       </w:r>
       <w:hyperlink r:id="rId15" w:history="1">
         <w:r>
-          <w:t>https://github.com/gabrielmontufar/article-118-nonstationary-liquefaction-benchmark/releases/tag/v1.8-geomechanics-geoengineering-retarget</w:t>
+          <w:t>https://github.com/gabrielmontufar/article-118-nonstationary-liquefaction-benchmark/releases/tag/v1.8-geomechanics-geoengineering</w:t>
         </w:r>
       </w:hyperlink>
       <w:r>
@@ -12958,7 +12958,7 @@
       </w:r>
       <w:hyperlink r:id="rId17" w:history="1">
         <w:r>
-          <w:t>https://github.com/gabrielmontufar/article-118-nonstationary-liquefaction-benchmark/releases/tag/v1.8-geomechanics-geoengineering-retarget</w:t>
+          <w:t>https://github.com/gabrielmontufar/article-118-nonstationary-liquefaction-benchmark/releases/tag/v1.8-geomechanics-geoengineering</w:t>
         </w:r>
       </w:hyperlink>
       <w:r>

</xml_diff>

<commit_message>
Reduce main manuscript abstract to 200 words
</commit_message>
<xml_diff>
--- a/manuscript/A reproducible reliability benchmark for non.docx
+++ b/manuscript/A reproducible reliability benchmark for non.docx
@@ -11,15 +11,21 @@
           <w:b/>
         </w:rPr>
       </w:pPr>
-      <w:bookmarkStart w:id="0" w:name="_GoBack"/>
       <w:r>
         <w:rPr>
           <w:b/>
         </w:rPr>
-        <w:t>A reproducible reliability benchmark for non-stationary liquefaction probability under groundwater and gradation-change scenarios</w:t>
-      </w:r>
-    </w:p>
-    <w:bookmarkEnd w:id="0"/>
+        <w:t>A reproducible reliab</w:t>
+      </w:r>
+      <w:bookmarkStart w:id="0" w:name="_GoBack"/>
+      <w:bookmarkEnd w:id="0"/>
+      <w:r>
+        <w:rPr>
+          <w:b/>
+        </w:rPr>
+        <w:t>ility benchmark for non-stationary liquefaction probability under groundwater and gradation-change scenarios</w:t>
+      </w:r>
+    </w:p>
     <w:p>
       <w:pPr>
         <w:pStyle w:val="Paragraph"/>
@@ -94,47 +100,7 @@
         <w:pStyle w:val="Abstract"/>
       </w:pPr>
       <w:r>
-        <w:t xml:space="preserve">Liquefaction assessments </w:t>
-      </w:r>
-      <w:proofErr w:type="gramStart"/>
-      <w:r>
-        <w:t>are commonly reported</w:t>
-      </w:r>
-      <w:proofErr w:type="gramEnd"/>
-      <w:r>
-        <w:t xml:space="preserve"> as a factor of safety or as a probability for a fixed groundwater condition and a fixed soil gradation. That representation is convenient for design checks, but it is incomplete when the </w:t>
-      </w:r>
-      <w:proofErr w:type="gramStart"/>
-      <w:r>
-        <w:t>groundwater</w:t>
-      </w:r>
-      <w:proofErr w:type="gramEnd"/>
-      <w:r>
-        <w:t xml:space="preserve"> table and the gradation of potentially liquefiable layers can evolve during the service life of an engineered system. This paper proposes a reproducible non-stationary reliability benchmark for estimating liquefaction probability under coupled groundwater and gradation scenarios. The framework defines a time-dependent limit-state function using cyclic stress ratio, cyclic resistance ratio, fines-content correction, model uncertainty, groundwater depth and </w:t>
-      </w:r>
-      <w:proofErr w:type="gramStart"/>
-      <w:r>
-        <w:t>layer-wise</w:t>
-      </w:r>
-      <w:proofErr w:type="gramEnd"/>
-      <w:r>
-        <w:t xml:space="preserve"> soil variability. A transparent four-layer profile is evaluated with Monte Carlo simulation across prescribed states in a 50-year planning horizon under stationary, rising, seasonal and extreme groundwater scenarios, combined with constant gradation, fines accumulation and fines washout. The benchmark compares deterministic, stationary-probabilistic and non-stationary probabilistic assessments. The results show that shallow layers that appear marginally stable under a stationary calculation can reach substantially higher computed probabilities of liquefaction when groundwater rise, extreme events and gradation evolution are considered. The contribution is not a new empirical triggering curve; it is an auditable workflow for converting liquefaction assessment into a scenario-conditioned probability indicator for </w:t>
-      </w:r>
-      <w:proofErr w:type="spellStart"/>
-      <w:r>
-        <w:t>geohazard</w:t>
-      </w:r>
-      <w:proofErr w:type="spellEnd"/>
-      <w:r>
-        <w:t xml:space="preserve"> screening-oriented analysis. The benchmark </w:t>
-      </w:r>
-      <w:proofErr w:type="gramStart"/>
-      <w:r>
-        <w:t>is intended</w:t>
-      </w:r>
-      <w:proofErr w:type="gramEnd"/>
-      <w:r>
-        <w:t xml:space="preserve"> for reproducible screening and trend-consistency evaluation rather than site-specific design calibration.</w:t>
+        <w:t>Liquefaction assessments are often reported as a factor of safety or as a probability for fixed groundwater and soil-gradation conditions. This stationary representation is convenient for design checks, but it is incomplete when groundwater depth and gradation states may change during the service life of an engineered system. This paper presents a reproducible non-stationary reliability benchmark for estimating liquefaction probability under coupled groundwater and gradation-change scenarios. The framework defines a time-dependent limit-state function using cyclic stress ratio, cyclic resistance ratio, fines-content correction, model uncertainty, groundwater depth and layer-wise soil variability. A transparent four-layer profile is evaluated with Monte Carlo simulation over a 50-year planning horizon under stationary, rising, seasonal and extreme groundwater scenarios combined with constant gradation, fines accumulation and fines washout. Deterministic, stationary-probabilistic and non-stationary probabilistic assessments are compared. Results show that shallow layers that appear marginally stable under stationary assumptions can reach higher computed liquefaction probabilities when groundwater rise, extreme events and gradation changes are included. The contribution is not a new empirical triggering curve, but an auditable workflow that converts liquefaction assessment into a scenario-conditioned probability indicator for geohazard screening. It supports reproducible trend-consistency evaluation rather than site-specific design calibration and transparent model checking in geoengineering workflows.</w:t>
       </w:r>
     </w:p>
     <w:p>
@@ -12909,9 +12875,6 @@
           <w:t>https://github.com/gabrielmontufar/article-118-nonstationary-liquefaction-benchmark/releases/tag/v1.8-geomechanics-geoengineering</w:t>
         </w:r>
       </w:hyperlink>
-      <w:r>
-        <w:t>.</w:t>
-      </w:r>
     </w:p>
     <w:p>
       <w:pPr>
@@ -17241,7 +17204,7 @@
 </file>
 
 <file path=customXml/itemProps1.xml><?xml version="1.0" encoding="utf-8"?>
-<ds:datastoreItem xmlns:ds="http://schemas.openxmlformats.org/officeDocument/2006/customXml" ds:itemID="{DBC25A1F-8DF1-4E61-AAF7-858502E83929}">
+<ds:datastoreItem xmlns:ds="http://schemas.openxmlformats.org/officeDocument/2006/customXml" ds:itemID="{14C30E9F-95EC-4B17-9CDE-196A823F5987}">
   <ds:schemaRefs>
     <ds:schemaRef ds:uri="http://schemas.openxmlformats.org/officeDocument/2006/bibliography"/>
   </ds:schemaRefs>

</xml_diff>